<commit_message>
Agrega auditorías de comprobantes, devolución de retenciones, reportes de control y mejoras contables.
Co-authored-by: Cursor <cursoragent@cursor.com>
</commit_message>
<xml_diff>
--- a/docs/manual-consultas-qbe/Manual_Usuario_AnitaERP_Consultas_Pagos.docx
+++ b/docs/manual-consultas-qbe/Manual_Usuario_AnitaERP_Consultas_Pagos.docx
@@ -48,7 +48,7 @@
           <w:sz w:val="24"/>
           <w:szCs w:val="24"/>
         </w:rPr>
-        <w:t xml:space="preserve">Empresa: </w:t>
+        <w:t xml:space="preserve">Empresa: AGG</w:t>
       </w:r>
     </w:p>
     <w:p>
@@ -74,7 +74,7 @@
           <w:sz w:val="20"/>
           <w:szCs w:val="20"/>
         </w:rPr>
-        <w:t xml:space="preserve">URL: http://10.20.30.210/seguridad/login</w:t>
+        <w:t xml:space="preserve">URL: http://10.20.30.210/anitaERP/public/seguridad/login</w:t>
       </w:r>
     </w:p>
     <w:p>
@@ -333,6 +333,19 @@
           <w:szCs w:val="22"/>
         </w:rPr>
         <w:t xml:space="preserve">Nueva OP abre una orden de pago del circuito. Pago vía IE abre ingresos y egresos con el tipo orden de pago, si el usuario tiene permiso.</w:t>
+      </w:r>
+    </w:p>
+    <w:p>
+      <w:pPr>
+        <w:jc w:val="both"/>
+        <w:spacing w:after="120"/>
+      </w:pPr>
+      <w:r>
+        <w:rPr>
+          <w:sz w:val="22"/>
+          <w:szCs w:val="22"/>
+        </w:rPr>
+        <w:t xml:space="preserve">En el listado de Pago a proveedores (no en esta consulta QBE) está la herramienta Devolver retenciones: sirve cuando hay que devolver al proveedor una retención mal practicada sin revertir toda la OP. El detalle operativo y el impacto en SICORE, IIBB, SUSS e IVA están en el Manual de Propuesta de pagos / Tesorería AP (capítulos 17 y 18).</w:t>
       </w:r>
     </w:p>
     <w:p>

</xml_diff>